<commit_message>
Rebuild the Word specification from the corrected sources
Section 1 and Annex A both restated the alignment targets, so the built
document was stale the moment the Markdown was corrected. Rebuilding it keeps
dist/ honest rather than leaving a document that contradicts its own canonical
source while claiming that source is authoritative.

The title page records source commit f06c0c9. Contents list, section 1, and
Annex A were re-checked after the rebuild: 28 pages, no wrapped identifiers,
no split table rows. dist/README.md now notes that the title page states the
source commit, so a reader can judge currency without comparing digests, and
that the v1.0.0-draft tag holds the artefacts as they stood at that tag while
main may carry newer ones.
</commit_message>
<xml_diff>
--- a/dist/AFDS-Draft-Specification-v1.0.0.docx
+++ b/dist/AFDS-Draft-Specification-v1.0.0.docx
@@ -769,7 +769,7 @@
                 <w:sz w:val="20"/>
                 <w:szCs w:val="20"/>
               </w:rPr>
-              <w:t xml:space="preserve">fc327dd</w:t>
+              <w:t xml:space="preserve">f06c0c9</w:t>
             </w:r>
           </w:p>
         </w:tc>
@@ -1104,7 +1104,7 @@
           <w:sz w:val="22"/>
           <w:szCs w:val="22"/>
         </w:rPr>
-        <w:t xml:space="preserve">The project intends to monitor and seek alignment with the W3C UI Specification Schema Community Group, the Design System Documentation Community Group, Open UI, and future Design Tokens Community Group work. The AFDS component-specification and evidence formats are provisional and are intended to be mapped to, or contributed as requirements for, those efforts rather than to become isolated terminology. A reader should treat every identifier and field name here as stable within this project and unstable outside it.</w:t>
+        <w:t xml:space="preserve">The project intends to monitor and seek alignment with the W3C Design System Documentation Community Group, Open UI, and future Design Tokens Community Group work. The W3C UI Specification Schema Community Group was previously named here as an alignment target; that group closed on 2026-05-21 without publishing a schema, so its charter is now read as a requirements input rather than as a vocabulary to align to. The AFDS component-specification and evidence formats are provisional and are intended to be mapped to, or contributed as requirements for, the remaining efforts rather than to become isolated terminology. A reader should treat every identifier and field name here as stable within this project and unstable outside it.</w:t>
       </w:r>
     </w:p>
     <w:p>
@@ -28230,7 +28230,43 @@
           <w:sz w:val="22"/>
           <w:szCs w:val="22"/>
         </w:rPr>
-        <w:t xml:space="preserve"> AFDS 1.0.0 is a project draft, not a W3C standard. The project will monitor and seek alignment with the W3C UI Specification Schema Community Group, the Design System Documentation Community Group, Open UI, and future DTCG work. The AFDS component-spec and evidence formats are provisional and are intended to be mapped to, or contributed as requirements for, those efforts rather than become isolated terminology. The supporting research is recorded in the portable representations research note.</w:t>
+        <w:t xml:space="preserve"> AFDS 1.0.0 is a project draft, not a W3C standard. As originally recorded, this decision said the project "will monitor and seek alignment with the W3C UI Specification Schema Community Group, the Design System Documentation Community Group, Open UI, and future DTCG work". That list is superseded and is kept here rather than deleted, because the reasoning above was formed while the first of those groups was believed to be live.</w:t>
+      </w:r>
+    </w:p>
+    <w:p>
+      <w:pPr>
+        <w:spacing w:after="160" w:before="0" w:line="300"/>
+      </w:pPr>
+      <w:r>
+        <w:rPr>
+          <w:rFonts w:ascii="Arial" w:cs="Arial" w:eastAsia="Arial" w:hAnsi="Arial"/>
+          <w:b w:val="false"/>
+          <w:bCs w:val="false"/>
+          <w:i w:val="false"/>
+          <w:iCs w:val="false"/>
+          <w:color w:val="000000"/>
+          <w:sz w:val="22"/>
+          <w:szCs w:val="22"/>
+        </w:rPr>
+        <w:t xml:space="preserve">The UI Specification Schema Community Group closed on 2026-05-21. It never chose a chair, its mailing list holds no messages, and it published no report or schema, so its charter is the entirety of its output. No successor has been announced. The consequence for this decision is limited but real: the charter is still valid evidence that a portable per-element specification covering layout, behaviour, constraints, and accessibility requirements is a recognised gap, which is part of why a bundle rather than a single format was chosen — but it is not a vocabulary this project can map onto, because no vocabulary exists.</w:t>
+      </w:r>
+    </w:p>
+    <w:p>
+      <w:pPr>
+        <w:spacing w:after="160" w:before="0" w:line="300"/>
+      </w:pPr>
+      <w:r>
+        <w:rPr>
+          <w:rFonts w:ascii="Arial" w:cs="Arial" w:eastAsia="Arial" w:hAnsi="Arial"/>
+          <w:b w:val="false"/>
+          <w:bCs w:val="false"/>
+          <w:i w:val="false"/>
+          <w:iCs w:val="false"/>
+          <w:color w:val="000000"/>
+          <w:sz w:val="22"/>
+          <w:szCs w:val="22"/>
+        </w:rPr>
+        <w:t xml:space="preserve">The alignment list is therefore the Design System Documentation Community Group, which now has co-chairs and an explicit DTCG and CEM compatibility goal but no draft, together with Open UI and future DTCG work. The AFDS component-spec and evidence formats are provisional and are intended to be mapped to, or contributed as requirements for, those efforts rather than become isolated terminology. Because the one live documentation group has no draft yet, contribution is currently the realistic form of alignment and consumption is not. The supporting research, including the evidence for each group's status, is recorded in the portable representations research note.</w:t>
       </w:r>
     </w:p>
     <w:p>

</xml_diff>